<commit_message>
Revert research paper back to Raspberry Pi Zero 2W baseline architecture while preserving IEEE layout, continuous citations [1]-[23], and clean diagrams
</commit_message>
<xml_diff>
--- a/TRAPNET_IEEE_Research_Paper_Final_v6.docx
+++ b/TRAPNET_IEEE_Research_Paper_Final_v6.docx
@@ -74,7 +74,7 @@
           <w:rFonts w:ascii="Times New Roman" w:hAnsi="Times New Roman"/>
           <w:sz w:val="19"/>
         </w:rPr>
-        <w:t>This paper presents TRAPNET, an autonomous Edge-AI physical intrusion containment and emergency response system combining a 24 GHz FMCW mmWave radar (HLK-LD2410C) with an Edge AI Vision Engine (YOLOv8 INT8) and dual-microcontroller architecture (ESP32 WROOM-32). TRAPNET eliminates the critical latency and false-alarm vulnerabilities of conventional passive CCTV monitoring by fusing micro-Doppler radar chest-displacement sensing with deep convolutional visual inference. Spatial cross-verification aligns camera pinhole geometry against radar range measurements (|D_vision - D_radar| &lt;= 25 cm), triggering active physical containment (solenoid deadbolts and non-lethal aerosol fog generators) within 45 ms of threat confirmation. An automated OpenCV structural similarity (SSIM) algorithm detects camera lens tampering within 35 ms, executing automatic failover to radar-only tracking mode. Field evaluations demonstrate 99.4% detection accuracy, sub-15ms vision inference, 0-lux night vision capability, and resilient quad-layer SOS emergency mesh dispatch (Wi-Fi Beacon, BLE Eddystone, SIM800L GSM SMS, and GPS telemetry).</w:t>
+        <w:t>This paper presents TRAPNET, an autonomous Edge-AI physical intrusion containment and emergency response system combining a 24 GHz FMCW mmWave radar (HLK-LD2410C) with an Edge Processing Engine (Raspberry Pi Zero 2W executing YOLOv8 INT8) and dual-microcontroller architecture (ESP32 WROOM-32). TRAPNET eliminates the critical latency and false-alarm vulnerabilities of conventional passive CCTV monitoring by fusing micro-Doppler radar chest-displacement sensing with deep convolutional visual inference. Spatial cross-verification aligns camera pinhole geometry against radar range measurements (|D_vision - D_radar| &lt;= 25 cm), triggering active physical containment (solenoid deadbolts and non-lethal aerosol fog generators) within 45 ms of threat confirmation. An automated OpenCV structural similarity (SSIM) algorithm detects camera lens tampering within 35 ms, executing automatic failover to radar-only tracking mode. Field evaluations demonstrate 99.4% detection accuracy, 0-lux night vision capability, and resilient quad-layer SOS emergency mesh dispatch (Wi-Fi Beacon, BLE Eddystone, SIM800L GSM SMS, and GPS telemetry).</w:t>
       </w:r>
     </w:p>
     <w:p>
@@ -96,7 +96,7 @@
           <w:rFonts w:ascii="Times New Roman" w:hAnsi="Times New Roman"/>
           <w:sz w:val="19"/>
         </w:rPr>
-        <w:t>Physical Intrusion Response, mmWave Radar, Sensor Fusion, Edge AI, YOLOv8 INT8, Active Physical Containment, Lens Tamper Failover, Resilient Emergency Mesh.</w:t>
+        <w:t>Physical Intrusion Response, mmWave Radar, Sensor Fusion, Edge AI, YOLOv8 INT8, Raspberry Pi Zero 2W, Active Physical Containment, Lens Tamper Failover, Resilient Emergency Mesh.</w:t>
       </w:r>
     </w:p>
     <w:p>
@@ -188,7 +188,7 @@
           <w:i/>
           <w:sz w:val="17"/>
         </w:rPr>
-        <w:t>Fig. 1. TRAPNET four-layer sensor-to-actuation architecture mapping Sensor Layer (LD2410 24GHz radar, CCTV, vibration, IR), Edge Processing Engine (Raspberry Pi / Mobile NPU &amp; ESP32), Physical Response Layer (solenoid deadbolt &amp; fog generator), and Resilient Emergency SOS Mesh.</w:t>
+        <w:t>Fig. 1. TRAPNET four-layer sensor-to-actuation architecture mapping Sensor Layer (LD2410 24GHz radar, CCTV, vibration, IR), Edge Processing Engine (Raspberry Pi Zero 2W &amp; ESP32), Physical Response Layer (solenoid deadbolt &amp; fog generator), and Resilient Emergency SOS Mesh.</w:t>
       </w:r>
     </w:p>
     <w:p>
@@ -214,7 +214,7 @@
         </w:rPr>
         <w:t>The primary technical contributions of TRAPNET include:</w:t>
         <w:br/>
-        <w:t>1) Dual-Mode Radar-Vision Fusion: Fuses 24 GHz FMCW mmWave radar micro-Doppler chest-displacement sensing with YOLOv8 visual inference to eliminate false positives.</w:t>
+        <w:t>1) Dual-Mode Radar-Vision Fusion: Fuses 24 GHz FMCW mmWave radar micro-Doppler chest-displacement sensing with YOLOv8 visual inference on a Raspberry Pi Zero 2W to eliminate false positives.</w:t>
         <w:br/>
         <w:t>2) Active Physical Containment Layer: Replaces passive alarms with immediate electro-mechanical containment consisting of a 12V 60kg solenoid deadbolt and an active aerosol fog generator.</w:t>
         <w:br/>
@@ -222,7 +222,7 @@
         <w:br/>
         <w:t>4) Quad-Layer Infrastructureless SOS Mesh: Solves internet and cellular jamming vulnerabilities by deploying Wi-Fi Beacon SSID flooding, BLE Eddystone URLs, SIM800L GSM SMS, and GPS telemetry.</w:t>
         <w:br/>
-        <w:t>5) Ultra-Low-Cost Embedded Architecture: Realizes high-end enterprise security capabilities on a total hardware prototype BOM of under $52.00.</w:t>
+        <w:t>5) Ultra-Low-Cost Embedded Architecture: Realizes high-end enterprise security capabilities on a total hardware prototype BOM of under $67.00.</w:t>
       </w:r>
     </w:p>
     <w:p>
@@ -336,7 +336,7 @@
         <w:rPr>
           <w:rFonts w:ascii="Times New Roman" w:hAnsi="Times New Roman"/>
         </w:rPr>
-        <w:t>Chatterjee et al. [5] implemented a YOLOv8-based physical intrusion detection system, emphasizing the necessity of model optimization for edge deployment. Their findings highlight that post-training integer quantization (INT8) reduces model parameter size by over 70% while maintaining detection accuracy within 2% of full FP32 precision. This enables sub-15ms inference latencies on embedded edge processors.</w:t>
+        <w:t>Chatterjee et al. [5] implemented a YOLOv8-based physical intrusion detection system, emphasizing the necessity of model optimization for edge deployment. Their findings highlight that post-training integer quantization (INT8) reduces model parameter size by over 70% while maintaining detection accuracy within 2% of full FP32 precision. This enables efficient inference latencies on embedded edge microprocessors like the Cortex-A53.</w:t>
       </w:r>
     </w:p>
     <w:p>
@@ -526,7 +526,7 @@
         <w:rPr>
           <w:rFonts w:ascii="Times New Roman" w:hAnsi="Times New Roman"/>
         </w:rPr>
-        <w:t>TRAPNET is organized into a four-layer hierarchical architecture: (1) Sensor Layer, (2) Edge Processing &amp; Fusion Engine, (3) Physical Response Layer, and (4) Resilient SOS Emergency Mesh. The core intelligence relies on spatial radar-vision cross-verification and a multi-modal threat scoring algorithm.</w:t>
+        <w:t>TRAPNET is organized into a four-layer hierarchical architecture: (1) Sensor Layer, (2) Edge Processing &amp; Fusion Engine (Raspberry Pi Zero 2W + ESP32 WROOM-32), (3) Physical Response Layer, and (4) Resilient SOS Emergency Mesh. The core intelligence relies on spatial radar-vision cross-verification and a multi-modal threat scoring algorithm.</w:t>
       </w:r>
     </w:p>
     <w:p>
@@ -584,7 +584,7 @@
         <w:rPr>
           <w:rFonts w:ascii="Times New Roman" w:hAnsi="Times New Roman"/>
         </w:rPr>
-        <w:t>The complete hardware system operates on a dual-controller architecture centered around the ESP32 DevKit V1 (30-pin WROOM-32) linked to the Edge AI Processor. The HLK-LD2410C 24 GHz mmWave radar connects to ESP32 Hardware Serial 2 (GPIO16 RX2 / GPIO17 TX2 @ 256,000 baud). Dual optocoupler-isolated relays drive a 12V 60kg solenoid deadbolt (GPIO32) and a 12V aerosol fog generator (GPIO33). Power distribution is regulated via dual LM2596 buck converters (5V main rail &amp; 4.1V dedicated GSM rail with 1000µF decoupling).</w:t>
+        <w:t>The complete hardware system operates on a dual-controller architecture centered around the ESP32 DevKit V1 (30-pin WROOM-32) linked to a Raspberry Pi Zero 2W via GPIO UART Serial (GPIO14 TX / GPIO36 RX @ 115,200 baud). The HLK-LD2410C 24 GHz mmWave radar connects to ESP32 Hardware Serial 2 (GPIO16 RX2 / GPIO17 TX2 @ 256,000 baud). Dual optocoupler-isolated relays drive a 12V 60kg solenoid deadbolt (GPIO32) and a 12V aerosol fog generator (GPIO33). Power distribution is regulated via dual LM2596 buck converters (5V main rail &amp; 4.1V dedicated GSM rail with 1000µF decoupling).</w:t>
       </w:r>
     </w:p>
     <w:p>
@@ -638,7 +638,7 @@
           <w:i/>
           <w:sz w:val="17"/>
         </w:rPr>
-        <w:t>Fig. 2. TRAPNET Hardware and Pin Circuit Diagram: Complete schematic mapping Sensor Layer (HLK-LD2410C 24GHz radar, SW-420 vibration, active IR beams), Processing Layer (ESP32 DevKit V1 &amp; Edge AI Processor), Actuation Layer (solenoid deadbolt &amp; aerosol fog relays), Power Distribution (LM2596 buck converters), and SOS Telemetry Modules (SIM800L GSM, NEO-6M GPS).</w:t>
+        <w:t>Fig. 2. TRAPNET Hardware and Pin Circuit Diagram: Complete schematic mapping Sensor Layer (HLK-LD2410C 24GHz radar, SW-420 vibration, active IR beams), Processing Layer (ESP32 DevKit V1 &amp; Raspberry Pi Zero 2W), Actuation Layer (solenoid deadbolt &amp; aerosol fog relays), Power Distribution (LM2596 buck converters), and SOS Telemetry Modules (SIM800L GSM, NEO-6M GPS).</w:t>
       </w:r>
     </w:p>
     <w:p>
@@ -1392,7 +1392,7 @@
                 <w:rFonts w:ascii="Times New Roman" w:hAnsi="Times New Roman"/>
                 <w:sz w:val="16"/>
               </w:rPr>
-              <w:t>YOLOv8 INT8 Vision Inference Engine</w:t>
+              <w:t>Raspberry Pi YOLOv8 Vision Inference Engine</w:t>
             </w:r>
           </w:p>
         </w:tc>
@@ -1416,7 +1416,7 @@
                 <w:rFonts w:ascii="Times New Roman" w:hAnsi="Times New Roman"/>
                 <w:sz w:val="16"/>
               </w:rPr>
-              <w:t>12.0 ms</w:t>
+              <w:t>150.0 ms</w:t>
             </w:r>
           </w:p>
         </w:tc>
@@ -1440,7 +1440,7 @@
                 <w:rFonts w:ascii="Times New Roman" w:hAnsi="Times New Roman"/>
                 <w:sz w:val="16"/>
               </w:rPr>
-              <w:t>Edge AI Processor / NPU Execution</w:t>
+              <w:t>Quad-Core ARM Cortex-A53 CPU</w:t>
             </w:r>
           </w:p>
         </w:tc>
@@ -3055,6 +3055,80 @@
                 <w:rFonts w:ascii="Times New Roman" w:hAnsi="Times New Roman"/>
                 <w:sz w:val="16"/>
               </w:rPr>
+              <w:t>Raspberry Pi Zero 2W (Quad-Core Compute)</w:t>
+            </w:r>
+          </w:p>
+        </w:tc>
+        <w:tc>
+          <w:tcPr>
+            <w:tcW w:type="dxa" w:w="3475"/>
+            <w:tcMar>
+              <w:top w:w="50" w:type="dxa"/>
+              <w:bottom w:w="50" w:type="dxa"/>
+              <w:left w:w="80" w:type="dxa"/>
+              <w:right w:w="80" w:type="dxa"/>
+            </w:tcMar>
+          </w:tcPr>
+          <w:p>
+            <w:pPr>
+              <w:spacing w:after="0"/>
+              <w:jc w:val="center"/>
+            </w:pPr>
+            <w:r>
+              <w:rPr>
+                <w:rFonts w:ascii="Times New Roman" w:hAnsi="Times New Roman"/>
+                <w:sz w:val="16"/>
+              </w:rPr>
+              <w:t>1</w:t>
+            </w:r>
+          </w:p>
+        </w:tc>
+        <w:tc>
+          <w:tcPr>
+            <w:tcW w:type="dxa" w:w="3475"/>
+            <w:tcMar>
+              <w:top w:w="50" w:type="dxa"/>
+              <w:bottom w:w="50" w:type="dxa"/>
+              <w:left w:w="80" w:type="dxa"/>
+              <w:right w:w="80" w:type="dxa"/>
+            </w:tcMar>
+          </w:tcPr>
+          <w:p>
+            <w:pPr>
+              <w:spacing w:after="0"/>
+              <w:jc w:val="center"/>
+            </w:pPr>
+            <w:r>
+              <w:rPr>
+                <w:rFonts w:ascii="Times New Roman" w:hAnsi="Times New Roman"/>
+                <w:sz w:val="16"/>
+              </w:rPr>
+              <w:t>$15.00</w:t>
+            </w:r>
+          </w:p>
+        </w:tc>
+      </w:tr>
+      <w:tr>
+        <w:tc>
+          <w:tcPr>
+            <w:tcW w:type="dxa" w:w="3475"/>
+            <w:tcMar>
+              <w:top w:w="50" w:type="dxa"/>
+              <w:bottom w:w="50" w:type="dxa"/>
+              <w:left w:w="80" w:type="dxa"/>
+              <w:right w:w="80" w:type="dxa"/>
+            </w:tcMar>
+          </w:tcPr>
+          <w:p>
+            <w:pPr>
+              <w:spacing w:after="0"/>
+              <w:jc w:val="center"/>
+            </w:pPr>
+            <w:r>
+              <w:rPr>
+                <w:rFonts w:ascii="Times New Roman" w:hAnsi="Times New Roman"/>
+                <w:sz w:val="16"/>
+              </w:rPr>
               <w:t>ESP32 DevKit V1 (30-pin WROOM-32)</w:t>
             </w:r>
           </w:p>
@@ -3627,7 +3701,7 @@
                 <w:b/>
                 <w:sz w:val="16"/>
               </w:rPr>
-              <w:t>$51.30 (Ultra-Low Cost)</w:t>
+              <w:t>$66.30 (Ultra-Low Cost)</w:t>
             </w:r>
           </w:p>
         </w:tc>
@@ -3656,7 +3730,7 @@
         <w:rPr>
           <w:rFonts w:ascii="Times New Roman" w:hAnsi="Times New Roman"/>
         </w:rPr>
-        <w:t>This paper presented TRAPNET, an autonomous Edge-AI physical intrusion response system combining 24 GHz mmWave radar with a multi-modal visual inference engine. By leveraging YOLOv8 INT8 edge acceleration, TRAPNET reduces vision inference latency to sub-15ms while achieving 99.4% threat detection accuracy. Spatial radar-vision cross-verification eliminates false alarms, while optocoupler-isolated relays execute physical containment (solenoid deadbolt and aerosol fog release) within 45 ms of threat validation. Future work includes scaling the mesh protocol to multi-building deployments and integrating thermal infrared camera arrays for dense smoke environments.</w:t>
+        <w:t>This paper presented TRAPNET, an autonomous Edge-AI physical intrusion response system combining 24 GHz mmWave radar with a Raspberry Pi Zero 2W visual inference engine. By leveraging YOLOv8 INT8 edge acceleration, TRAPNET achieves 99.4% threat detection accuracy. Spatial radar-vision cross-verification eliminates false alarms, while optocoupler-isolated relays execute physical containment (solenoid deadbolt and aerosol fog release) within 45 ms of threat validation. Future work includes scaling the mesh protocol to multi-building deployments and integrating thermal infrared camera arrays for dense smoke environments.</w:t>
       </w:r>
     </w:p>
     <w:p>

</xml_diff>